<commit_message>
Setup the environment and added the setup
</commit_message>
<xml_diff>
--- a/docs/Functionality_Queries_Group06.docx
+++ b/docs/Functionality_Queries_Group06.docx
@@ -720,7 +720,17 @@
           <w:sz w:val="28"/>
           <w:szCs w:val="28"/>
         </w:rPr>
-        <w:t>Description</w:t>
+        <w:t>De</w:t>
+      </w:r>
+      <w:bookmarkStart w:id="1" w:name="_GoBack"/>
+      <w:bookmarkEnd w:id="1"/>
+      <w:r>
+        <w:rPr>
+          <w:rFonts w:ascii="Calibri" w:eastAsia="Calibri" w:hAnsi="Calibri" w:cs="Calibri"/>
+          <w:sz w:val="28"/>
+          <w:szCs w:val="28"/>
+        </w:rPr>
+        <w:t>scription</w:t>
       </w:r>
     </w:p>
     <w:p>
@@ -744,8 +754,8 @@
           <w:b/>
         </w:rPr>
       </w:pPr>
-      <w:bookmarkStart w:id="1" w:name="_993j86c49b5j" w:colFirst="0" w:colLast="0"/>
-      <w:bookmarkEnd w:id="1"/>
+      <w:bookmarkStart w:id="2" w:name="_993j86c49b5j" w:colFirst="0" w:colLast="0"/>
+      <w:bookmarkEnd w:id="2"/>
       <w:r>
         <w:rPr>
           <w:rFonts w:ascii="Calibri" w:eastAsia="Calibri" w:hAnsi="Calibri" w:cs="Calibri"/>
@@ -937,8 +947,8 @@
           <w:b/>
         </w:rPr>
       </w:pPr>
-      <w:bookmarkStart w:id="2" w:name="_i2mlhz7su5wl" w:colFirst="0" w:colLast="0"/>
-      <w:bookmarkEnd w:id="2"/>
+      <w:bookmarkStart w:id="3" w:name="_i2mlhz7su5wl" w:colFirst="0" w:colLast="0"/>
+      <w:bookmarkEnd w:id="3"/>
       <w:proofErr w:type="spellStart"/>
       <w:r>
         <w:rPr>
@@ -1075,8 +1085,8 @@
           <w:b/>
         </w:rPr>
       </w:pPr>
-      <w:bookmarkStart w:id="3" w:name="_2usbwyldp3xy" w:colFirst="0" w:colLast="0"/>
-      <w:bookmarkEnd w:id="3"/>
+      <w:bookmarkStart w:id="4" w:name="_2usbwyldp3xy" w:colFirst="0" w:colLast="0"/>
+      <w:bookmarkEnd w:id="4"/>
       <w:r>
         <w:rPr>
           <w:rFonts w:ascii="Calibri" w:eastAsia="Calibri" w:hAnsi="Calibri" w:cs="Calibri"/>
@@ -1306,8 +1316,8 @@
           <w:b/>
         </w:rPr>
       </w:pPr>
-      <w:bookmarkStart w:id="4" w:name="_mklfmor7e6l6" w:colFirst="0" w:colLast="0"/>
-      <w:bookmarkEnd w:id="4"/>
+      <w:bookmarkStart w:id="5" w:name="_mklfmor7e6l6" w:colFirst="0" w:colLast="0"/>
+      <w:bookmarkEnd w:id="5"/>
       <w:proofErr w:type="spellStart"/>
       <w:r>
         <w:rPr>
@@ -1514,8 +1524,8 @@
           <w:b/>
         </w:rPr>
       </w:pPr>
-      <w:bookmarkStart w:id="5" w:name="_8weziuq22v3t" w:colFirst="0" w:colLast="0"/>
-      <w:bookmarkEnd w:id="5"/>
+      <w:bookmarkStart w:id="6" w:name="_8weziuq22v3t" w:colFirst="0" w:colLast="0"/>
+      <w:bookmarkEnd w:id="6"/>
       <w:r>
         <w:rPr>
           <w:rFonts w:ascii="Calibri" w:eastAsia="Calibri" w:hAnsi="Calibri" w:cs="Calibri"/>
@@ -1762,8 +1772,8 @@
           <w:b/>
         </w:rPr>
       </w:pPr>
-      <w:bookmarkStart w:id="6" w:name="_bbydx3pvm94g" w:colFirst="0" w:colLast="0"/>
-      <w:bookmarkEnd w:id="6"/>
+      <w:bookmarkStart w:id="7" w:name="_bbydx3pvm94g" w:colFirst="0" w:colLast="0"/>
+      <w:bookmarkEnd w:id="7"/>
       <w:r>
         <w:rPr>
           <w:rFonts w:ascii="Calibri" w:eastAsia="Calibri" w:hAnsi="Calibri" w:cs="Calibri"/>
@@ -1984,8 +1994,8 @@
           <w:b/>
         </w:rPr>
       </w:pPr>
-      <w:bookmarkStart w:id="7" w:name="_fq26t27dcn4z" w:colFirst="0" w:colLast="0"/>
-      <w:bookmarkEnd w:id="7"/>
+      <w:bookmarkStart w:id="8" w:name="_fq26t27dcn4z" w:colFirst="0" w:colLast="0"/>
+      <w:bookmarkEnd w:id="8"/>
       <w:proofErr w:type="spellStart"/>
       <w:r>
         <w:rPr>
@@ -2295,8 +2305,8 @@
           <w:b/>
         </w:rPr>
       </w:pPr>
-      <w:bookmarkStart w:id="8" w:name="_axgmjx6r4i" w:colFirst="0" w:colLast="0"/>
-      <w:bookmarkEnd w:id="8"/>
+      <w:bookmarkStart w:id="9" w:name="_axgmjx6r4i" w:colFirst="0" w:colLast="0"/>
+      <w:bookmarkEnd w:id="9"/>
       <w:r>
         <w:rPr>
           <w:rFonts w:ascii="Calibri" w:eastAsia="Calibri" w:hAnsi="Calibri" w:cs="Calibri"/>
@@ -2329,6 +2339,7 @@
       <w:r>
         <w:rPr>
           <w:rFonts w:ascii="Roboto Mono" w:eastAsia="Roboto Mono" w:hAnsi="Roboto Mono" w:cs="Roboto Mono"/>
+          <w:noProof/>
         </w:rPr>
         <w:drawing>
           <wp:inline distT="0" distB="0" distL="0" distR="0" wp14:anchorId="21382C28" wp14:editId="790BF33A">
@@ -2424,6 +2435,7 @@
       <w:r>
         <w:rPr>
           <w:rFonts w:ascii="Roboto Mono" w:eastAsia="Roboto Mono" w:hAnsi="Roboto Mono" w:cs="Roboto Mono"/>
+          <w:noProof/>
         </w:rPr>
         <w:drawing>
           <wp:inline distT="0" distB="0" distL="0" distR="0" wp14:anchorId="25ECF9BF" wp14:editId="4AF95B69">
@@ -2540,6 +2552,7 @@
       <w:r>
         <w:rPr>
           <w:rFonts w:ascii="Roboto Mono" w:eastAsia="Roboto Mono" w:hAnsi="Roboto Mono" w:cs="Roboto Mono"/>
+          <w:noProof/>
         </w:rPr>
         <w:lastRenderedPageBreak/>
         <w:drawing>
@@ -2643,6 +2656,7 @@
       <w:r>
         <w:rPr>
           <w:rFonts w:ascii="Roboto Mono" w:eastAsia="Roboto Mono" w:hAnsi="Roboto Mono" w:cs="Roboto Mono"/>
+          <w:noProof/>
         </w:rPr>
         <w:drawing>
           <wp:inline distT="0" distB="0" distL="0" distR="0" wp14:anchorId="2E38EFD5" wp14:editId="39D7414F">
@@ -2745,6 +2759,7 @@
       <w:r>
         <w:rPr>
           <w:rFonts w:ascii="Roboto Mono" w:eastAsia="Roboto Mono" w:hAnsi="Roboto Mono" w:cs="Roboto Mono"/>
+          <w:noProof/>
         </w:rPr>
         <w:lastRenderedPageBreak/>
         <w:drawing>
@@ -2848,6 +2863,7 @@
       <w:r>
         <w:rPr>
           <w:rFonts w:ascii="Roboto Mono" w:eastAsia="Roboto Mono" w:hAnsi="Roboto Mono" w:cs="Roboto Mono"/>
+          <w:noProof/>
         </w:rPr>
         <w:drawing>
           <wp:inline distT="0" distB="0" distL="0" distR="0" wp14:anchorId="0CDDBDB9" wp14:editId="2614B982">
@@ -2950,6 +2966,7 @@
       <w:r>
         <w:rPr>
           <w:rFonts w:ascii="Roboto Mono" w:eastAsia="Roboto Mono" w:hAnsi="Roboto Mono" w:cs="Roboto Mono"/>
+          <w:noProof/>
         </w:rPr>
         <w:drawing>
           <wp:inline distT="0" distB="0" distL="0" distR="0" wp14:anchorId="64B383B8" wp14:editId="20EA7DCE">
@@ -3060,6 +3077,7 @@
       <w:r>
         <w:rPr>
           <w:rFonts w:ascii="Roboto Mono" w:eastAsia="Roboto Mono" w:hAnsi="Roboto Mono" w:cs="Roboto Mono"/>
+          <w:noProof/>
         </w:rPr>
         <w:drawing>
           <wp:inline distT="0" distB="0" distL="0" distR="0" wp14:anchorId="09388236" wp14:editId="2C224253">
@@ -3284,6 +3302,7 @@
         <w:rPr>
           <w:rFonts w:asciiTheme="minorHAnsi" w:hAnsiTheme="minorHAnsi" w:cstheme="minorHAnsi"/>
           <w:b/>
+          <w:noProof/>
           <w:sz w:val="28"/>
           <w:szCs w:val="28"/>
         </w:rPr>
@@ -3379,6 +3398,7 @@
       </w:pPr>
       <w:r>
         <w:rPr>
+          <w:noProof/>
           <w:sz w:val="28"/>
           <w:szCs w:val="28"/>
         </w:rPr>
@@ -3459,6 +3479,7 @@
       </w:pPr>
       <w:r>
         <w:rPr>
+          <w:noProof/>
           <w:sz w:val="28"/>
           <w:szCs w:val="28"/>
         </w:rPr>
@@ -3539,6 +3560,7 @@
       </w:pPr>
       <w:r>
         <w:rPr>
+          <w:noProof/>
           <w:sz w:val="28"/>
           <w:szCs w:val="28"/>
         </w:rPr>
@@ -3643,6 +3665,7 @@
       </w:pPr>
       <w:r>
         <w:rPr>
+          <w:noProof/>
           <w:sz w:val="28"/>
           <w:szCs w:val="28"/>
         </w:rPr>
@@ -3724,6 +3747,7 @@
       </w:pPr>
       <w:r>
         <w:rPr>
+          <w:noProof/>
           <w:sz w:val="28"/>
           <w:szCs w:val="28"/>
         </w:rPr>
@@ -3803,6 +3827,7 @@
       </w:pPr>
       <w:r>
         <w:rPr>
+          <w:noProof/>
           <w:sz w:val="28"/>
           <w:szCs w:val="28"/>
         </w:rPr>
@@ -3910,6 +3935,7 @@
       </w:pPr>
       <w:r>
         <w:rPr>
+          <w:noProof/>
           <w:sz w:val="28"/>
           <w:szCs w:val="28"/>
         </w:rPr>
@@ -3990,6 +4016,7 @@
       </w:pPr>
       <w:r>
         <w:rPr>
+          <w:noProof/>
           <w:sz w:val="28"/>
           <w:szCs w:val="28"/>
         </w:rPr>
@@ -4069,6 +4096,7 @@
       </w:pPr>
       <w:r>
         <w:rPr>
+          <w:noProof/>
           <w:sz w:val="28"/>
           <w:szCs w:val="28"/>
         </w:rPr>
@@ -4173,6 +4201,7 @@
       </w:pPr>
       <w:r>
         <w:rPr>
+          <w:noProof/>
           <w:sz w:val="28"/>
           <w:szCs w:val="28"/>
         </w:rPr>
@@ -4360,6 +4389,7 @@
       <w:r>
         <w:rPr>
           <w:bCs/>
+          <w:noProof/>
           <w:sz w:val="28"/>
           <w:szCs w:val="28"/>
         </w:rPr>
@@ -4464,6 +4494,7 @@
       <w:r>
         <w:rPr>
           <w:bCs/>
+          <w:noProof/>
           <w:sz w:val="28"/>
           <w:szCs w:val="28"/>
         </w:rPr>
@@ -4544,6 +4575,7 @@
       </w:pPr>
       <w:r>
         <w:rPr>
+          <w:noProof/>
           <w:sz w:val="28"/>
           <w:szCs w:val="28"/>
         </w:rPr>
@@ -4637,6 +4669,7 @@
       </w:pPr>
       <w:r>
         <w:rPr>
+          <w:noProof/>
           <w:sz w:val="28"/>
           <w:szCs w:val="28"/>
         </w:rPr>
@@ -4758,6 +4791,7 @@
       </w:pPr>
       <w:r>
         <w:rPr>
+          <w:noProof/>
           <w:sz w:val="28"/>
           <w:szCs w:val="28"/>
         </w:rPr>
@@ -4838,6 +4872,7 @@
       </w:pPr>
       <w:r>
         <w:rPr>
+          <w:noProof/>
           <w:sz w:val="28"/>
           <w:szCs w:val="28"/>
         </w:rPr>
@@ -4919,6 +4954,7 @@
       </w:pPr>
       <w:r>
         <w:rPr>
+          <w:noProof/>
           <w:sz w:val="28"/>
           <w:szCs w:val="28"/>
         </w:rPr>
@@ -5007,6 +5043,7 @@
       </w:pPr>
       <w:r>
         <w:rPr>
+          <w:noProof/>
           <w:sz w:val="28"/>
           <w:szCs w:val="28"/>
         </w:rPr>
@@ -5189,6 +5226,7 @@
       </w:pPr>
       <w:r>
         <w:rPr>
+          <w:noProof/>
           <w:sz w:val="28"/>
           <w:szCs w:val="28"/>
         </w:rPr>
@@ -5260,15 +5298,7 @@
           <w:sz w:val="32"/>
           <w:szCs w:val="32"/>
         </w:rPr>
-        <w:t xml:space="preserve">. </w:t>
-      </w:r>
-      <w:r>
-        <w:rPr>
-          <w:b/>
-          <w:sz w:val="32"/>
-          <w:szCs w:val="32"/>
-        </w:rPr>
-        <w:t>Analytical Queries (Aggregates)</w:t>
+        <w:t>. Analytical Queries (Aggregates)</w:t>
       </w:r>
     </w:p>
     <w:p>
@@ -5302,6 +5332,7 @@
       </w:pPr>
       <w:r>
         <w:rPr>
+          <w:noProof/>
           <w:sz w:val="28"/>
           <w:szCs w:val="28"/>
         </w:rPr>
@@ -5381,6 +5412,7 @@
       </w:pPr>
       <w:r>
         <w:rPr>
+          <w:noProof/>
           <w:sz w:val="28"/>
           <w:szCs w:val="28"/>
         </w:rPr>
@@ -5461,6 +5493,7 @@
       </w:pPr>
       <w:r>
         <w:rPr>
+          <w:noProof/>
           <w:sz w:val="28"/>
           <w:szCs w:val="28"/>
         </w:rPr>
@@ -5566,6 +5599,7 @@
       </w:pPr>
       <w:r>
         <w:rPr>
+          <w:noProof/>
           <w:sz w:val="28"/>
           <w:szCs w:val="28"/>
         </w:rPr>
@@ -5638,6 +5672,7 @@
       </w:pPr>
       <w:r>
         <w:rPr>
+          <w:noProof/>
           <w:sz w:val="32"/>
           <w:szCs w:val="28"/>
         </w:rPr>
@@ -5799,6 +5834,7 @@
       <w:r>
         <w:rPr>
           <w:rFonts w:eastAsiaTheme="minorHAnsi"/>
+          <w:noProof/>
         </w:rPr>
         <w:drawing>
           <wp:inline distT="0" distB="0" distL="0" distR="0" wp14:anchorId="04DC6E14" wp14:editId="6201F02E">
@@ -5864,27 +5900,19 @@
           <w:sz w:val="28"/>
           <w:szCs w:val="28"/>
         </w:rPr>
-        <w:t>Resources requested AND allocated (INTERS</w:t>
-      </w:r>
-      <w:bookmarkStart w:id="9" w:name="_GoBack"/>
-      <w:bookmarkEnd w:id="9"/>
-      <w:r>
-        <w:rPr>
-          <w:sz w:val="28"/>
-          <w:szCs w:val="28"/>
-        </w:rPr>
-        <w:t>ECT)</w:t>
-      </w:r>
-    </w:p>
-    <w:p>
-      <w:pPr>
-        <w:rPr>
-          <w:sz w:val="28"/>
-          <w:szCs w:val="28"/>
-        </w:rPr>
-      </w:pPr>
-      <w:r>
-        <w:rPr>
+        <w:t>Resources requested AND allocated (INTERSECT)</w:t>
+      </w:r>
+    </w:p>
+    <w:p>
+      <w:pPr>
+        <w:rPr>
+          <w:sz w:val="28"/>
+          <w:szCs w:val="28"/>
+        </w:rPr>
+      </w:pPr>
+      <w:r>
+        <w:rPr>
+          <w:noProof/>
           <w:sz w:val="28"/>
           <w:szCs w:val="28"/>
         </w:rPr>
@@ -5989,6 +6017,7 @@
       </w:pPr>
       <w:r>
         <w:rPr>
+          <w:noProof/>
           <w:sz w:val="28"/>
           <w:szCs w:val="28"/>
         </w:rPr>
@@ -6085,6 +6114,7 @@
       </w:pPr>
       <w:r>
         <w:rPr>
+          <w:noProof/>
           <w:sz w:val="28"/>
           <w:szCs w:val="28"/>
         </w:rPr>
@@ -6205,6 +6235,7 @@
       </w:pPr>
       <w:r>
         <w:rPr>
+          <w:noProof/>
           <w:sz w:val="28"/>
           <w:szCs w:val="28"/>
         </w:rPr>
@@ -6284,6 +6315,7 @@
       </w:pPr>
       <w:r>
         <w:rPr>
+          <w:noProof/>
           <w:sz w:val="28"/>
           <w:szCs w:val="28"/>
         </w:rPr>
@@ -7936,6 +7968,7 @@
   <w:style w:type="character" w:default="1" w:styleId="DefaultParagraphFont">
     <w:name w:val="Default Paragraph Font"/>
     <w:uiPriority w:val="1"/>
+    <w:semiHidden/>
     <w:unhideWhenUsed/>
   </w:style>
   <w:style w:type="table" w:default="1" w:styleId="TableNormal">

</xml_diff>